<commit_message>
Replace course-slide citations with original books and articles
Co-Authored-By: Claude Opus 5.5 <noreply@anthropic.com>
Claude-Session: https://claude.ai/code/session_013eZbSDorZB8dhyvM8NFPNW
</commit_message>
<xml_diff>
--- a/negotiation-final-project/למידה_אישית_מריאן.docx
+++ b/negotiation-final-project/למידה_אישית_מריאן.docx
@@ -116,7 +116,7 @@
           <w:i w:val="0"/>
           <w:noProof/>
         </w:rPr>
-        <w:t xml:space="preserve"> התוצאה שלי הייתה הסגנון המוותר במקום הראשון והסגנון הנמנע במקום השני. זה לא ממש הפתיע אותי, אבל זו הייתה הפעם הראשונה שראיתי את זה כתוב במספרים, וזה היה לא נעים. מה שלמדתי מהתוצאה הוא שלכל סגנון יש מחיר. סגנון שנראה לי "נחמד" יכול להיות ויתור על אינטרסים שלי, וסגנון שנראה לי "קשוח" מתאים לפעמים בדיוק, למשל מול ספק, כפי שרנא תיארה בריאיון. מודל העניין הכפול עזר לי להבין שהשאלה היא כמה חשובה לי התוצאה וכמה חשוב לי הקשר, ולא מה נעים לי (Rahim, 1983, כפי שמצוטט אצל הוכמן, 2026).</w:t>
+        <w:t xml:space="preserve"> התוצאה שלי הייתה הסגנון המוותר במקום הראשון והסגנון הנמנע במקום השני. זה לא ממש הפתיע אותי, אבל זו הייתה הפעם הראשונה שראיתי את זה כתוב במספרים, וזה היה לא נעים. מה שלמדתי מהתוצאה הוא שלכל סגנון יש מחיר. סגנון שנראה לי "נחמד" יכול להיות ויתור על אינטרסים שלי, וסגנון שנראה לי "קשוח" מתאים לפעמים בדיוק, למשל מול ספק, כפי שרנא תיארה בריאיון. מודל העניין הכפול עזר לי להבין שהשאלה היא כמה חשובה לי התוצאה וכמה חשוב לי הקשר, ולא מה נעים לי (Rahim, 1983).</w:t>
       </w:r>
     </w:p>
     <w:p>
@@ -135,7 +135,7 @@
           <w:i w:val="0"/>
           <w:noProof/>
         </w:rPr>
-        <w:t xml:space="preserve"> בריאיון עם רנא הרשימה אותי בעיקר הכנות שלה: היא סיפרה שפתחה את המשא ומתן עם המורות בדרישה קשוחה, מתוך לחץ שקיבלה מלמעלה, ושזו הייתה טעות. מה ששינה את התמונה היה ערב אחד אחרי אזעקה, שבו שמעה את הסיפורים האישיים של המורות. זה היה עבורי המחשה חיה לעיקרון "היו נוקשים בסוגיה, רכים עם האנשים" שלמדנו בשיעור (הוכמן, 2026): רנא לא ויתרה על כך שבית הספר יהיה פתוח, אבל הפסיקה לראות במורות יריבות. זה גרם לי לחשוב על הפעמים שבהן אני עצמי העברתי הלאה לחץ שקיבלתי, בלי לבדוק מה עובר על מי שמולי. בעבודה, כשהמנהלת שלי דרשה לסיים משימה עד סוף השבוע, העברתי את הדרישה לעמיתה כמו שהיא, בלי לשאול אם יש לה מגבלה, וגיליתי מאוחר מדי שהיא בדיוק הייתה בתקופה קשה בבית.</w:t>
+        <w:t xml:space="preserve"> בריאיון עם רנא הרשימה אותי בעיקר הכנות שלה: היא סיפרה שפתחה את המשא ומתן עם המורות בדרישה קשוחה, מתוך לחץ שקיבלה מלמעלה, ושזו הייתה טעות. מה ששינה את התמונה היה ערב אחד אחרי אזעקה, שבו שמעה את הסיפורים האישיים של המורות. זה היה עבורי המחשה חיה לעיקרון "היו נוקשים בסוגיה, רכים עם האנשים" שלמדנו בשיעור (פישר ואחרים, 2013): רנא לא ויתרה על כך שבית הספר יהיה פתוח, אבל הפסיקה לראות במורות יריבות. זה גרם לי לחשוב על הפעמים שבהן אני עצמי העברתי הלאה לחץ שקיבלתי, בלי לבדוק מה עובר על מי שמולי. בעבודה, כשהמנהלת שלי דרשה לסיים משימה עד סוף השבוע, העברתי את הדרישה לעמיתה כמו שהיא, בלי לשאול אם יש לה מגבלה, וגיליתי מאוחר מדי שהיא בדיוק הייתה בתקופה קשה בבית.</w:t>
       </w:r>
     </w:p>
     <w:p>
@@ -154,7 +154,7 @@
           <w:i w:val="0"/>
           <w:noProof/>
         </w:rPr>
-        <w:t xml:space="preserve"> לפני הקורס לא הכרתי את המושג BATNA, והיום הוא הדבר הראשון שאני חושבת עליו. בשיעור הוא הוגדר כחלופה הטובה ביותר להסכם, שנמצאת מחוץ למשא ומתן וקובעת מתי עדיף לקום מהשולחן, ולצידו ה־ZOPA, טווח ההסכמה שבין הקווים האדומים של הצדדים (הוכמן, 2026). במקרה של רנא מול ספק התגבור ראיתי איך שתי הצעות מחיר מחברות אחרות שינו את כל הטון של המשא ומתן. כלשונה, "כשיש לך לאן ללכת, את לא צריכה לאיים, מספיק שהצד השני יודע". הבנתי שהביטחון שלי במשא ומתן לא צריך לבוא מהאופי, אלא מההכנה, כמו שפישר, יורי ופאטון (2013) ממליצים לפתח את ה־BATNA דווקא כשהצד השני חזק יותר.</w:t>
+        <w:t xml:space="preserve"> לפני הקורס לא הכרתי את המושג BATNA, והיום הוא הדבר הראשון שאני חושבת עליו. בשיעור הוא הוגדר כחלופה הטובה ביותר להסכם, שנמצאת מחוץ למשא ומתן וקובעת מתי עדיף לקום מהשולחן, ולצידו ה־ZOPA, טווח ההסכמה שבין הקווים האדומים של הצדדים (Lewicki et al., 1999). במקרה של רנא מול ספק התגבור ראיתי איך שתי הצעות מחיר מחברות אחרות שינו את כל הטון של המשא ומתן. כלשונה, "כשיש לך לאן ללכת, את לא צריכה לאיים, מספיק שהצד השני יודע". הבנתי שהביטחון שלי במשא ומתן לא צריך לבוא מהאופי, אלא מההכנה, כמו שפישר, יורי ופאטון (2013) ממליצים לפתח את ה־BATNA דווקא כשהצד השני חזק יותר.</w:t>
       </w:r>
     </w:p>
     <w:p>
@@ -192,7 +192,7 @@
           <w:i w:val="0"/>
           <w:noProof/>
         </w:rPr>
-        <w:t xml:space="preserve"> הייתי בטוחה ש"לחתוך באמצע" הוא הדרך ההוגנת לסיים מחלוקת. הקורס לימד אותי להבחין בין פשרה לבין משא ומתן אינטגרטיבי: פשרה מחלקת את העוגה הקיימת, ואילו גישה אינטגרטיבית מנסה להגדיל אותה (הוכמן, 2026). דילמת האסיר, שהוצגה בשיעור, הראתה לי שהתנהגות שנראית רציונלית לכל צד בנפרד יכולה להוביל לתוצאה גרועה לשניהם (הוכמן, 2026). במקרה של סמיר מול ועד ההורים, המחיר נסגר בסוף באמצע, אבל מה שבאמת פתר את המחלוקת היו המלגות, פתרון שלא היה בראש של אף אחד בהתחלה (פישר ואחרים, 2013). מעכשיו, לפני שאני מציעה חצי־חצי, אני שואלת אם יש אפשרות שלישית.</w:t>
+        <w:t xml:space="preserve"> הייתי בטוחה ש"לחתוך באמצע" הוא הדרך ההוגנת לסיים מחלוקת. הקורס לימד אותי להבחין בין פשרה לבין משא ומתן אינטגרטיבי: פשרה מחלקת את העוגה הקיימת, ואילו גישה אינטגרטיבית מנסה להגדיל אותה (Lewicki et al., 1999). דילמת האסיר, שהוצגה בשיעור, הראתה לי שהתנהגות שנראית רציונלית לכל צד בנפרד יכולה להוביל לתוצאה גרועה לשניהם (רייכרד, 2019). במקרה של סמיר מול ועד ההורים, המחיר נסגר בסוף באמצע, אבל מה שבאמת פתר את המחלוקת היו המלגות, פתרון שלא היה בראש של אף אחד בהתחלה (פישר ואחרים, 2013). מעכשיו, לפני שאני מציעה חצי־חצי, אני שואלת אם יש אפשרות שלישית.</w:t>
       </w:r>
     </w:p>
     <w:p>
@@ -211,7 +211,7 @@
           <w:i w:val="0"/>
           <w:noProof/>
         </w:rPr>
-        <w:t xml:space="preserve"> אני צריכה לתרגל שלושה דברים: להבחין בין אסטרטגיה, כלומר היעד ארוך הטווח, לבין הטקטיקות שבהן אני משתמשת בכל פגישה (הוכמן, 2026), להגיע מוכנה עם נתונים ועם חלופה, לומר בקול מה אני צריכה ולא רק להסכים, ולשאול יותר שאלות לפני שאני מציעה פתרון. </w:t>
+        <w:t xml:space="preserve"> אני צריכה לתרגל שלושה דברים: להבחין בין אסטרטגיה, כלומר היעד ארוך הטווח, לבין הטקטיקות שבהן אני משתמשת בכל פגישה (לאונרד, 1977), להגיע מוכנה עם נתונים ועם חלופה, לומר בקול מה אני צריכה ולא רק להסכים, ולשאול יותר שאלות לפני שאני מציעה פתרון. </w:t>
       </w:r>
       <w:r>
         <w:rPr>
@@ -253,7 +253,24 @@
           <w:i w:val="0"/>
           <w:noProof/>
         </w:rPr>
-        <w:t>הוכמן, ר' (2026). מבוא למו"מ; ניהול מו"מ [מצגות הרצאה]. ניהול משא ומתן, הקריה האקדמית אונו.</w:t>
+        <w:t xml:space="preserve">לאונרד, ר' א' (1977). </w:t>
+      </w:r>
+      <w:r>
+        <w:rPr>
+          <w:b w:val="0"/>
+          <w:i/>
+          <w:iCs/>
+          <w:noProof/>
+        </w:rPr>
+        <w:t>על המלחמה: מדריך קצר לקלאוזביץ</w:t>
+      </w:r>
+      <w:r>
+        <w:rPr>
+          <w:b w:val="0"/>
+          <w:i w:val="0"/>
+          <w:noProof/>
+        </w:rPr>
+        <w:t xml:space="preserve"> (ע' לוטם, מתרגם). מערכות.</w:t>
       </w:r>
     </w:p>
     <w:p>
@@ -285,6 +302,119 @@
           <w:noProof/>
         </w:rPr>
         <w:t>. מטר.</w:t>
+      </w:r>
+    </w:p>
+    <w:p>
+      <w:pPr>
+        <w:ind w:hanging="709" w:right="709"/>
+        <w:jc w:val="right"/>
+      </w:pPr>
+      <w:r>
+        <w:rPr>
+          <w:b w:val="0"/>
+          <w:i w:val="0"/>
+          <w:noProof/>
+        </w:rPr>
+        <w:t xml:space="preserve">רייכרד, א' (2019). </w:t>
+      </w:r>
+      <w:r>
+        <w:rPr>
+          <w:b w:val="0"/>
+          <w:i/>
+          <w:iCs/>
+          <w:noProof/>
+        </w:rPr>
+        <w:t>המשך הסכסוך באמצעים אחרים: מניעים אסטרטגיים, התנהגות שחקנים ותהליכי משא ומתן כוזבים</w:t>
+      </w:r>
+      <w:r>
+        <w:rPr>
+          <w:b w:val="0"/>
+          <w:i w:val="0"/>
+          <w:noProof/>
+        </w:rPr>
+        <w:t xml:space="preserve"> [עבודת דוקטורט]. אוניברסיטת תל אביב.</w:t>
+      </w:r>
+    </w:p>
+    <w:p>
+      <w:pPr>
+        <w:bidi w:val="0"/>
+        <w:ind w:hanging="709" w:left="709"/>
+        <w:jc w:val="left"/>
+      </w:pPr>
+      <w:r>
+        <w:rPr>
+          <w:rFonts w:ascii="Times New Roman" w:hAnsi="Times New Roman" w:cs="Times New Roman"/>
+          <w:b w:val="0"/>
+          <w:i w:val="0"/>
+          <w:noProof/>
+          <w:rtl w:val="0"/>
+          <w:lang w:val="en-US" w:bidi="he-IL"/>
+        </w:rPr>
+        <w:t xml:space="preserve">Lewicki, R. J., Saunders, D. M., &amp; Minton, J. W. (1999). </w:t>
+      </w:r>
+      <w:r>
+        <w:rPr>
+          <w:rFonts w:ascii="Times New Roman" w:hAnsi="Times New Roman" w:cs="Times New Roman"/>
+          <w:b w:val="0"/>
+          <w:i/>
+          <w:iCs/>
+          <w:noProof/>
+          <w:rtl w:val="0"/>
+          <w:lang w:val="en-US" w:bidi="he-IL"/>
+        </w:rPr>
+        <w:t>Negotiation</w:t>
+      </w:r>
+      <w:r>
+        <w:rPr>
+          <w:rFonts w:ascii="Times New Roman" w:hAnsi="Times New Roman" w:cs="Times New Roman"/>
+          <w:b w:val="0"/>
+          <w:i w:val="0"/>
+          <w:noProof/>
+          <w:rtl w:val="0"/>
+          <w:lang w:val="en-US" w:bidi="he-IL"/>
+        </w:rPr>
+        <w:t xml:space="preserve"> (3rd ed.). Irwin/McGraw-Hill.</w:t>
+      </w:r>
+    </w:p>
+    <w:p>
+      <w:pPr>
+        <w:bidi w:val="0"/>
+        <w:ind w:hanging="709" w:left="709"/>
+        <w:jc w:val="left"/>
+      </w:pPr>
+      <w:r>
+        <w:rPr>
+          <w:rFonts w:ascii="Times New Roman" w:hAnsi="Times New Roman" w:cs="Times New Roman"/>
+          <w:b w:val="0"/>
+          <w:i w:val="0"/>
+          <w:noProof/>
+          <w:rtl w:val="0"/>
+          <w:lang w:val="en-US" w:bidi="he-IL"/>
+        </w:rPr>
+        <w:t xml:space="preserve">Rahim, M. A. (1983). A measure of styles of handling interpersonal conflict. </w:t>
+      </w:r>
+      <w:r>
+        <w:rPr>
+          <w:rFonts w:ascii="Times New Roman" w:hAnsi="Times New Roman" w:cs="Times New Roman"/>
+          <w:b w:val="0"/>
+          <w:i/>
+          <w:iCs/>
+          <w:noProof/>
+          <w:rtl w:val="0"/>
+          <w:lang w:val="en-US" w:bidi="he-IL"/>
+        </w:rPr>
+        <w:t>Academy of Management Journal, 26</w:t>
+      </w:r>
+      <w:r>
+        <w:rPr>
+          <w:rFonts w:ascii="Times New Roman" w:hAnsi="Times New Roman" w:cs="Times New Roman"/>
+          <w:b w:val="0"/>
+          <w:i w:val="0"/>
+          <w:noProof/>
+          <w:rtl w:val="0"/>
+          <w:lang w:val="en-US" w:bidi="he-IL"/>
+        </w:rPr>
+        <w:t>(2), 368-376.</w:t>
       </w:r>
     </w:p>
     <w:sectPr>

</xml_diff>